<commit_message>
Add heading with date
</commit_message>
<xml_diff>
--- a/clinical-notes/Health and Wellness Coaching Final Visit.docx
+++ b/clinical-notes/Health and Wellness Coaching Final Visit.docx
@@ -34,6 +34,353 @@
           <w:sz w:val="20"/>
           <w:szCs w:val="20"/>
         </w:rPr>
+        <w:t xml:space="preserve">LOCAL TITLE: </w:t>
+      </w:r>
+      <w:r>
+        <w:rPr>
+          <w:rFonts w:cs="Courier New"/>
+          <w:kern w:val="0"/>
+          <w:sz w:val="20"/>
+          <w:szCs w:val="20"/>
+        </w:rPr>
+        <w:t>HEALTH AND WELLNESS COACHING</w:t>
+      </w:r>
+      <w:r>
+        <w:rPr>
+          <w:rFonts w:cs="Courier New"/>
+          <w:kern w:val="0"/>
+          <w:sz w:val="20"/>
+          <w:szCs w:val="20"/>
+        </w:rPr>
+        <w:t xml:space="preserve">                             </w:t>
+      </w:r>
+    </w:p>
+    <w:p>
+      <w:pPr>
+        <w:tabs>
+          <w:tab w:val="left" w:pos="960"/>
+          <w:tab w:val="left" w:pos="1920"/>
+          <w:tab w:val="left" w:pos="2880"/>
+          <w:tab w:val="left" w:pos="3840"/>
+          <w:tab w:val="left" w:pos="4800"/>
+          <w:tab w:val="left" w:pos="5760"/>
+          <w:tab w:val="left" w:pos="6720"/>
+          <w:tab w:val="left" w:pos="7680"/>
+          <w:tab w:val="left" w:pos="8640"/>
+          <w:tab w:val="left" w:pos="9600"/>
+        </w:tabs>
+        <w:autoSpaceDE w:val="0"/>
+        <w:autoSpaceDN w:val="0"/>
+        <w:adjustRightInd w:val="0"/>
+        <w:spacing w:after="0" w:line="240" w:lineRule="auto"/>
+        <w:rPr>
+          <w:rFonts w:cs="Courier New"/>
+          <w:kern w:val="0"/>
+          <w:sz w:val="20"/>
+          <w:szCs w:val="20"/>
+        </w:rPr>
+      </w:pPr>
+      <w:r>
+        <w:rPr>
+          <w:rFonts w:cs="Courier New"/>
+          <w:kern w:val="0"/>
+          <w:sz w:val="20"/>
+          <w:szCs w:val="20"/>
+        </w:rPr>
+        <w:t xml:space="preserve">STANDARD TITLE: INTEGRATIVE HEALTH NOTE                         </w:t>
+      </w:r>
+    </w:p>
+    <w:p>
+      <w:pPr>
+        <w:tabs>
+          <w:tab w:val="left" w:pos="960"/>
+          <w:tab w:val="left" w:pos="1920"/>
+          <w:tab w:val="left" w:pos="2880"/>
+          <w:tab w:val="left" w:pos="3840"/>
+          <w:tab w:val="left" w:pos="4800"/>
+          <w:tab w:val="left" w:pos="5760"/>
+          <w:tab w:val="left" w:pos="6720"/>
+          <w:tab w:val="left" w:pos="7680"/>
+          <w:tab w:val="left" w:pos="8640"/>
+          <w:tab w:val="left" w:pos="9600"/>
+        </w:tabs>
+        <w:autoSpaceDE w:val="0"/>
+        <w:autoSpaceDN w:val="0"/>
+        <w:adjustRightInd w:val="0"/>
+        <w:spacing w:after="0" w:line="240" w:lineRule="auto"/>
+        <w:rPr>
+          <w:rFonts w:cs="Courier New"/>
+          <w:kern w:val="0"/>
+          <w:sz w:val="20"/>
+          <w:szCs w:val="20"/>
+        </w:rPr>
+      </w:pPr>
+      <w:r>
+        <w:rPr>
+          <w:rFonts w:cs="Courier New"/>
+          <w:kern w:val="0"/>
+          <w:sz w:val="20"/>
+          <w:szCs w:val="20"/>
+        </w:rPr>
+        <w:t xml:space="preserve">DATE OF NOTE: </w:t>
+      </w:r>
+      <w:r>
+        <w:rPr>
+          <w:rFonts w:cs="Courier New"/>
+          <w:kern w:val="0"/>
+          <w:sz w:val="20"/>
+          <w:szCs w:val="20"/>
+        </w:rPr>
+        <w:t>APR</w:t>
+      </w:r>
+      <w:r>
+        <w:rPr>
+          <w:rFonts w:cs="Courier New"/>
+          <w:kern w:val="0"/>
+          <w:sz w:val="20"/>
+          <w:szCs w:val="20"/>
+        </w:rPr>
+        <w:t xml:space="preserve"> </w:t>
+      </w:r>
+      <w:r>
+        <w:rPr>
+          <w:rFonts w:cs="Courier New"/>
+          <w:kern w:val="0"/>
+          <w:sz w:val="20"/>
+          <w:szCs w:val="20"/>
+        </w:rPr>
+        <w:t>14</w:t>
+      </w:r>
+      <w:r>
+        <w:rPr>
+          <w:rFonts w:cs="Courier New"/>
+          <w:kern w:val="0"/>
+          <w:sz w:val="20"/>
+          <w:szCs w:val="20"/>
+        </w:rPr>
+        <w:t xml:space="preserve">, </w:t>
+      </w:r>
+      <w:r>
+        <w:rPr>
+          <w:rFonts w:cs="Courier New"/>
+          <w:kern w:val="0"/>
+          <w:sz w:val="20"/>
+          <w:szCs w:val="20"/>
+        </w:rPr>
+        <w:t>2026@11:00</w:t>
+      </w:r>
+      <w:r>
+        <w:rPr>
+          <w:rFonts w:cs="Courier New"/>
+          <w:kern w:val="0"/>
+          <w:sz w:val="20"/>
+          <w:szCs w:val="20"/>
+        </w:rPr>
+        <w:t xml:space="preserve">     </w:t>
+      </w:r>
+      <w:r>
+        <w:rPr>
+          <w:rFonts w:cs="Courier New"/>
+          <w:kern w:val="0"/>
+          <w:sz w:val="20"/>
+          <w:szCs w:val="20"/>
+        </w:rPr>
+        <w:tab/>
+      </w:r>
+      <w:r>
+        <w:rPr>
+          <w:rFonts w:cs="Courier New"/>
+          <w:kern w:val="0"/>
+          <w:sz w:val="20"/>
+          <w:szCs w:val="20"/>
+        </w:rPr>
+        <w:tab/>
+      </w:r>
+      <w:r>
+        <w:rPr>
+          <w:rFonts w:cs="Courier New"/>
+          <w:kern w:val="0"/>
+          <w:sz w:val="20"/>
+          <w:szCs w:val="20"/>
+        </w:rPr>
+        <w:t xml:space="preserve">ENTRY DATE: </w:t>
+      </w:r>
+      <w:r>
+        <w:rPr>
+          <w:rFonts w:cs="Courier New"/>
+          <w:kern w:val="0"/>
+          <w:sz w:val="20"/>
+          <w:szCs w:val="20"/>
+        </w:rPr>
+        <w:t>APR</w:t>
+      </w:r>
+      <w:r>
+        <w:rPr>
+          <w:rFonts w:cs="Courier New"/>
+          <w:kern w:val="0"/>
+          <w:sz w:val="20"/>
+          <w:szCs w:val="20"/>
+        </w:rPr>
+        <w:t xml:space="preserve"> </w:t>
+      </w:r>
+      <w:r>
+        <w:rPr>
+          <w:rFonts w:cs="Courier New"/>
+          <w:kern w:val="0"/>
+          <w:sz w:val="20"/>
+          <w:szCs w:val="20"/>
+        </w:rPr>
+        <w:t>14</w:t>
+      </w:r>
+      <w:r>
+        <w:rPr>
+          <w:rFonts w:cs="Courier New"/>
+          <w:kern w:val="0"/>
+          <w:sz w:val="20"/>
+          <w:szCs w:val="20"/>
+        </w:rPr>
+        <w:t xml:space="preserve">, 2026@11:00:43      </w:t>
+      </w:r>
+    </w:p>
+    <w:p>
+      <w:pPr>
+        <w:tabs>
+          <w:tab w:val="left" w:pos="960"/>
+          <w:tab w:val="left" w:pos="1920"/>
+          <w:tab w:val="left" w:pos="2880"/>
+          <w:tab w:val="left" w:pos="3840"/>
+          <w:tab w:val="left" w:pos="4800"/>
+          <w:tab w:val="left" w:pos="5760"/>
+          <w:tab w:val="left" w:pos="6720"/>
+          <w:tab w:val="left" w:pos="7680"/>
+          <w:tab w:val="left" w:pos="8640"/>
+          <w:tab w:val="left" w:pos="9600"/>
+        </w:tabs>
+        <w:autoSpaceDE w:val="0"/>
+        <w:autoSpaceDN w:val="0"/>
+        <w:adjustRightInd w:val="0"/>
+        <w:spacing w:after="0" w:line="240" w:lineRule="auto"/>
+        <w:rPr>
+          <w:rFonts w:cs="Courier New"/>
+          <w:kern w:val="0"/>
+          <w:sz w:val="20"/>
+          <w:szCs w:val="20"/>
+        </w:rPr>
+      </w:pPr>
+      <w:r>
+        <w:rPr>
+          <w:rFonts w:cs="Courier New"/>
+          <w:kern w:val="0"/>
+          <w:sz w:val="20"/>
+          <w:szCs w:val="20"/>
+        </w:rPr>
+        <w:t xml:space="preserve">AUTHOR: </w:t>
+      </w:r>
+      <w:r>
+        <w:rPr>
+          <w:rFonts w:cs="Courier New"/>
+          <w:kern w:val="0"/>
+          <w:sz w:val="20"/>
+          <w:szCs w:val="20"/>
+        </w:rPr>
+        <w:tab/>
+        <w:t>COACH, CATHY B.</w:t>
+      </w:r>
+      <w:r>
+        <w:rPr>
+          <w:rFonts w:cs="Courier New"/>
+          <w:kern w:val="0"/>
+          <w:sz w:val="20"/>
+          <w:szCs w:val="20"/>
+        </w:rPr>
+        <w:tab/>
+      </w:r>
+      <w:r>
+        <w:rPr>
+          <w:rFonts w:cs="Courier New"/>
+          <w:kern w:val="0"/>
+          <w:sz w:val="20"/>
+          <w:szCs w:val="20"/>
+        </w:rPr>
+        <w:tab/>
+      </w:r>
+      <w:r>
+        <w:rPr>
+          <w:rFonts w:cs="Courier New"/>
+          <w:kern w:val="0"/>
+          <w:sz w:val="20"/>
+          <w:szCs w:val="20"/>
+        </w:rPr>
+        <w:tab/>
+      </w:r>
+      <w:r>
+        <w:rPr>
+          <w:rFonts w:cs="Courier New"/>
+          <w:kern w:val="0"/>
+          <w:sz w:val="20"/>
+          <w:szCs w:val="20"/>
+        </w:rPr>
+        <w:t xml:space="preserve">EXP COSIGNER:                           </w:t>
+      </w:r>
+    </w:p>
+    <w:p>
+      <w:pPr>
+        <w:tabs>
+          <w:tab w:val="left" w:pos="960"/>
+          <w:tab w:val="left" w:pos="1920"/>
+          <w:tab w:val="left" w:pos="2880"/>
+          <w:tab w:val="left" w:pos="3840"/>
+          <w:tab w:val="left" w:pos="4800"/>
+          <w:tab w:val="left" w:pos="5760"/>
+          <w:tab w:val="left" w:pos="6720"/>
+          <w:tab w:val="left" w:pos="7680"/>
+          <w:tab w:val="left" w:pos="8640"/>
+          <w:tab w:val="left" w:pos="9600"/>
+        </w:tabs>
+        <w:autoSpaceDE w:val="0"/>
+        <w:autoSpaceDN w:val="0"/>
+        <w:adjustRightInd w:val="0"/>
+        <w:spacing w:after="0" w:line="240" w:lineRule="auto"/>
+        <w:rPr>
+          <w:rFonts w:cs="Courier New"/>
+          <w:kern w:val="0"/>
+          <w:sz w:val="20"/>
+          <w:szCs w:val="20"/>
+        </w:rPr>
+      </w:pPr>
+    </w:p>
+    <w:p>
+      <w:pPr>
+        <w:tabs>
+          <w:tab w:val="left" w:pos="960"/>
+          <w:tab w:val="left" w:pos="1920"/>
+          <w:tab w:val="left" w:pos="2880"/>
+          <w:tab w:val="left" w:pos="3840"/>
+          <w:tab w:val="left" w:pos="4800"/>
+          <w:tab w:val="left" w:pos="5760"/>
+          <w:tab w:val="left" w:pos="6720"/>
+          <w:tab w:val="left" w:pos="7680"/>
+          <w:tab w:val="left" w:pos="8640"/>
+          <w:tab w:val="left" w:pos="9600"/>
+        </w:tabs>
+        <w:autoSpaceDE w:val="0"/>
+        <w:autoSpaceDN w:val="0"/>
+        <w:adjustRightInd w:val="0"/>
+        <w:spacing w:after="0" w:line="240" w:lineRule="auto"/>
+        <w:rPr>
+          <w:rFonts w:cs="Courier New"/>
+          <w:kern w:val="0"/>
+          <w:sz w:val="20"/>
+          <w:szCs w:val="20"/>
+        </w:rPr>
+      </w:pPr>
+      <w:r>
+        <w:rPr>
+          <w:rFonts w:cs="Courier New"/>
+          <w:kern w:val="0"/>
+          <w:sz w:val="20"/>
+          <w:szCs w:val="20"/>
+        </w:rPr>
         <w:t>Health and Wellness Coaching</w:t>
       </w:r>
     </w:p>
@@ -1632,6 +1979,7 @@
           <w:sz w:val="20"/>
           <w:szCs w:val="20"/>
         </w:rPr>
+        <w:lastRenderedPageBreak/>
         <w:t>Long-Term S.M.A.R.T. Whole Health Goals:</w:t>
       </w:r>
     </w:p>
@@ -3479,6 +3827,7 @@
           <w:sz w:val="20"/>
           <w:szCs w:val="20"/>
         </w:rPr>
+        <w:lastRenderedPageBreak/>
         <w:t>Plan:</w:t>
       </w:r>
     </w:p>

</xml_diff>